<commit_message>
Update deployment diagnostics and API URL
</commit_message>
<xml_diff>
--- a/期末刷_产品说明文档_V1.0.docx
+++ b/期末刷_产品说明文档_V1.0.docx
@@ -11,8 +11,6 @@
           <w:lang w:val="en-US" w:eastAsia="zh-CN"/>
         </w:rPr>
       </w:pPr>
-      <w:bookmarkStart w:id="0" w:name="_GoBack"/>
-      <w:bookmarkEnd w:id="0"/>
       <w:r>
         <w:rPr>
           <w:rFonts w:hint="eastAsia" w:cs="微软雅黑"/>
@@ -7037,6 +7035,27 @@
         <w:t>如果知识库中没有相关内容,输出「资料中未涉及此内容」</w:t>
       </w:r>
     </w:p>
+    <w:p>
+      <w:pPr>
+        <w:pStyle w:val="16"/>
+        <w:numPr>
+          <w:ilvl w:val="0"/>
+          <w:numId w:val="1"/>
+        </w:numPr>
+        <w:spacing w:before="30" w:after="30" w:line="320" w:lineRule="auto"/>
+      </w:pPr>
+      <w:bookmarkStart w:id="0" w:name="_GoBack"/>
+      <w:r>
+        <w:rPr>
+          <w:rFonts w:hint="eastAsia" w:cs="微软雅黑"/>
+          <w:sz w:val="22"/>
+          <w:szCs w:val="22"/>
+          <w:lang w:val="en-US" w:eastAsia="zh-CN"/>
+        </w:rPr>
+        <w:t>语义相近的也可以判为覆盖要点，灵活评判</w:t>
+      </w:r>
+    </w:p>
+    <w:bookmarkEnd w:id="0"/>
     <w:p>
       <w:r>
         <w:br w:type="page"/>

</xml_diff>